<commit_message>
chore(ag): update gemeinde baubewilling system template
</commit_message>
<xml_diff>
--- a/document-merge-service/kt_ag/templatefiles/Gemeinde_Baubewilligung.docx
+++ b/document-merge-service/kt_ag/templatefiles/Gemeinde_Baubewilligung.docx
@@ -95,7 +95,6 @@
         </w:rPr>
         <w:tab/>
       </w:r>
-      <w:proofErr w:type="gramStart"/>
       <w:r>
         <w:rPr>
           <w:szCs w:val="20"/>
@@ -106,28 +105,7 @@
         <w:rPr>
           <w:szCs w:val="20"/>
         </w:rPr>
-        <w:t>DOSSIER</w:t>
-      </w:r>
-      <w:proofErr w:type="gramEnd"/>
-      <w:r>
-        <w:rPr>
-          <w:szCs w:val="20"/>
-        </w:rPr>
-        <w:t>_</w:t>
-      </w:r>
-      <w:proofErr w:type="gramStart"/>
-      <w:r>
-        <w:rPr>
-          <w:szCs w:val="20"/>
-        </w:rPr>
-        <w:t>NUMMER }</w:t>
-      </w:r>
-      <w:proofErr w:type="gramEnd"/>
-      <w:r>
-        <w:rPr>
-          <w:szCs w:val="20"/>
-        </w:rPr>
-        <w:t>}</w:t>
+        <w:t>DOSSIER_NUMMER }}</w:t>
       </w:r>
     </w:p>
     <w:p>
@@ -160,33 +138,11 @@
         </w:rPr>
         <w:tab/>
       </w:r>
-      <w:proofErr w:type="gramStart"/>
-      <w:r>
-        <w:rPr>
-          <w:szCs w:val="20"/>
-        </w:rPr>
-        <w:t>{{ ALLE</w:t>
-      </w:r>
-      <w:proofErr w:type="gramEnd"/>
-      <w:r>
-        <w:rPr>
-          <w:szCs w:val="20"/>
-        </w:rPr>
-        <w:t>_GESUCHSTELLER_NAME_</w:t>
-      </w:r>
-      <w:proofErr w:type="gramStart"/>
-      <w:r>
-        <w:rPr>
-          <w:szCs w:val="20"/>
-        </w:rPr>
-        <w:t>ADRESSE }</w:t>
-      </w:r>
-      <w:proofErr w:type="gramEnd"/>
-      <w:r>
-        <w:rPr>
-          <w:szCs w:val="20"/>
-        </w:rPr>
-        <w:t>}</w:t>
+      <w:r>
+        <w:rPr>
+          <w:szCs w:val="20"/>
+        </w:rPr>
+        <w:t>{{ ALLE_GESUCHSTELLER_NAME_ADRESSE }}</w:t>
       </w:r>
     </w:p>
     <w:p>
@@ -217,33 +173,11 @@
         </w:rPr>
         <w:tab/>
       </w:r>
-      <w:proofErr w:type="gramStart"/>
-      <w:r>
-        <w:rPr>
-          <w:szCs w:val="20"/>
-        </w:rPr>
-        <w:t>{{ GRUNDEIGENTUEMER</w:t>
-      </w:r>
-      <w:proofErr w:type="gramEnd"/>
-      <w:r>
-        <w:rPr>
-          <w:szCs w:val="20"/>
-        </w:rPr>
-        <w:t>_NAME_</w:t>
-      </w:r>
-      <w:proofErr w:type="gramStart"/>
-      <w:r>
-        <w:rPr>
-          <w:szCs w:val="20"/>
-        </w:rPr>
-        <w:t>ADRESSE }</w:t>
-      </w:r>
-      <w:proofErr w:type="gramEnd"/>
-      <w:r>
-        <w:rPr>
-          <w:szCs w:val="20"/>
-        </w:rPr>
-        <w:t>}</w:t>
+      <w:r>
+        <w:rPr>
+          <w:szCs w:val="20"/>
+        </w:rPr>
+        <w:t>{{ GRUNDEIGENTUEMER_NAME_ADRESSE }}</w:t>
       </w:r>
     </w:p>
     <w:p>
@@ -273,33 +207,11 @@
         </w:rPr>
         <w:tab/>
       </w:r>
-      <w:proofErr w:type="gramStart"/>
-      <w:r>
-        <w:rPr>
-          <w:szCs w:val="20"/>
-        </w:rPr>
-        <w:t>{{ PROJEKTVERFASSER</w:t>
-      </w:r>
-      <w:proofErr w:type="gramEnd"/>
-      <w:r>
-        <w:rPr>
-          <w:szCs w:val="20"/>
-        </w:rPr>
-        <w:t>_NAME_</w:t>
-      </w:r>
-      <w:proofErr w:type="gramStart"/>
-      <w:r>
-        <w:rPr>
-          <w:szCs w:val="20"/>
-        </w:rPr>
-        <w:t>ADRESSE }</w:t>
-      </w:r>
-      <w:proofErr w:type="gramEnd"/>
-      <w:r>
-        <w:rPr>
-          <w:szCs w:val="20"/>
-        </w:rPr>
-        <w:t>}</w:t>
+      <w:r>
+        <w:rPr>
+          <w:szCs w:val="20"/>
+        </w:rPr>
+        <w:t>{{ PROJEKTVERFASSER_NAME_ADRESSE }}</w:t>
       </w:r>
     </w:p>
     <w:p>
@@ -337,33 +249,11 @@
         </w:rPr>
         <w:tab/>
       </w:r>
-      <w:proofErr w:type="gramStart"/>
-      <w:r>
-        <w:rPr>
-          <w:szCs w:val="20"/>
-        </w:rPr>
-        <w:t>{{ BESCHREIBUNG</w:t>
-      </w:r>
-      <w:proofErr w:type="gramEnd"/>
-      <w:r>
-        <w:rPr>
-          <w:szCs w:val="20"/>
-        </w:rPr>
-        <w:t>_</w:t>
-      </w:r>
-      <w:proofErr w:type="gramStart"/>
-      <w:r>
-        <w:rPr>
-          <w:szCs w:val="20"/>
-        </w:rPr>
-        <w:t>BAUVORHABEN }</w:t>
-      </w:r>
-      <w:proofErr w:type="gramEnd"/>
-      <w:r>
-        <w:rPr>
-          <w:szCs w:val="20"/>
-        </w:rPr>
-        <w:t>}</w:t>
+      <w:r>
+        <w:rPr>
+          <w:szCs w:val="20"/>
+        </w:rPr>
+        <w:t>{{ BESCHREIBUNG_BAUVORHABEN }}</w:t>
       </w:r>
     </w:p>
     <w:p>
@@ -393,19 +283,11 @@
         </w:rPr>
         <w:tab/>
       </w:r>
-      <w:proofErr w:type="gramStart"/>
-      <w:r>
-        <w:rPr>
-          <w:szCs w:val="20"/>
-        </w:rPr>
-        <w:t>{{ KOORDINATEN</w:t>
-      </w:r>
-      <w:proofErr w:type="gramEnd"/>
-      <w:r>
-        <w:rPr>
-          <w:szCs w:val="20"/>
-        </w:rPr>
-        <w:t xml:space="preserve"> }}</w:t>
+      <w:r>
+        <w:rPr>
+          <w:szCs w:val="20"/>
+        </w:rPr>
+        <w:t>{{ KOORDINATEN }}</w:t>
       </w:r>
       <w:r>
         <w:rPr>
@@ -413,19 +295,11 @@
         </w:rPr>
         <w:t xml:space="preserve"> / </w:t>
       </w:r>
-      <w:proofErr w:type="gramStart"/>
-      <w:r>
-        <w:rPr>
-          <w:szCs w:val="20"/>
-        </w:rPr>
-        <w:t>{{ PARZELLE</w:t>
-      </w:r>
-      <w:proofErr w:type="gramEnd"/>
-      <w:r>
-        <w:rPr>
-          <w:szCs w:val="20"/>
-        </w:rPr>
-        <w:t xml:space="preserve"> }}</w:t>
+      <w:r>
+        <w:rPr>
+          <w:szCs w:val="20"/>
+        </w:rPr>
+        <w:t>{{ PARZELLE }}</w:t>
       </w:r>
     </w:p>
     <w:p>
@@ -470,19 +344,11 @@
         </w:rPr>
         <w:tab/>
       </w:r>
-      <w:proofErr w:type="gramStart"/>
-      <w:r>
-        <w:rPr>
-          <w:szCs w:val="20"/>
-        </w:rPr>
-        <w:t>{{ NUTZUNGSZONE</w:t>
-      </w:r>
-      <w:proofErr w:type="gramEnd"/>
-      <w:r>
-        <w:rPr>
-          <w:szCs w:val="20"/>
-        </w:rPr>
-        <w:t xml:space="preserve"> }}</w:t>
+      <w:r>
+        <w:rPr>
+          <w:szCs w:val="20"/>
+        </w:rPr>
+        <w:t>{{ NUTZUNGSZONE }}</w:t>
       </w:r>
     </w:p>
     <w:p>
@@ -563,99 +429,64 @@
         </w:rPr>
         <w:tab/>
       </w:r>
-      <w:proofErr w:type="gramStart"/>
-      <w:r>
-        <w:rPr>
-          <w:szCs w:val="20"/>
-        </w:rPr>
-        <w:t>{{ BAUKOSTEN</w:t>
-      </w:r>
-      <w:proofErr w:type="gramEnd"/>
-      <w:r>
-        <w:rPr>
-          <w:szCs w:val="20"/>
-        </w:rPr>
-        <w:t xml:space="preserve"> }}</w:t>
-      </w:r>
-    </w:p>
-    <w:p>
-      <w:pPr>
-        <w:rPr>
-          <w:szCs w:val="20"/>
-        </w:rPr>
-      </w:pPr>
-      <w:r>
-        <w:rPr>
-          <w:szCs w:val="20"/>
-        </w:rPr>
+      <w:r>
+        <w:rPr>
+          <w:szCs w:val="20"/>
+        </w:rPr>
+        <w:t>{{ BAUKOSTEN }}</w:t>
+      </w:r>
+    </w:p>
+    <w:p>
+      <w:pPr>
+        <w:rPr>
+          <w:szCs w:val="20"/>
+        </w:rPr>
+      </w:pPr>
+      <w:r>
         <w:t>Auflage</w:t>
       </w:r>
       <w:r>
-        <w:rPr>
-          <w:szCs w:val="20"/>
-        </w:rPr>
-        <w:tab/>
-      </w:r>
-      <w:r>
-        <w:rPr>
-          <w:szCs w:val="20"/>
-        </w:rPr>
-        <w:tab/>
-      </w:r>
-      <w:r>
-        <w:rPr>
-          <w:szCs w:val="20"/>
-        </w:rPr>
-        <w:tab/>
-      </w:r>
-      <w:r>
-        <w:rPr>
-          <w:szCs w:val="20"/>
-        </w:rPr>
-        <w:tab/>
-      </w:r>
-      <w:proofErr w:type="gramStart"/>
-      <w:r>
-        <w:rPr>
-          <w:szCs w:val="20"/>
-        </w:rPr>
-        <w:t>{{ PUBLIKATION</w:t>
-      </w:r>
-      <w:proofErr w:type="gramEnd"/>
-      <w:r>
-        <w:rPr>
-          <w:szCs w:val="20"/>
-        </w:rPr>
-        <w:t>_GEMEINDE_</w:t>
-      </w:r>
-      <w:proofErr w:type="gramStart"/>
-      <w:r>
-        <w:rPr>
-          <w:szCs w:val="20"/>
-        </w:rPr>
-        <w:t>ENDE }</w:t>
-      </w:r>
-      <w:proofErr w:type="gramEnd"/>
-      <w:r>
-        <w:rPr>
-          <w:szCs w:val="20"/>
-        </w:rPr>
-        <w:t>}</w:t>
-      </w:r>
-    </w:p>
-    <w:p>
-      <w:pPr>
-        <w:rPr>
-          <w:color w:val="000000" w:themeColor="text1"/>
-          <w:szCs w:val="20"/>
-        </w:rPr>
-      </w:pPr>
-      <w:r>
-        <w:rPr>
-          <w:color w:val="000000" w:themeColor="text1"/>
-          <w:szCs w:val="20"/>
-        </w:rPr>
-        <w:t>Pläne</w:t>
+        <w:tab/>
+      </w:r>
+      <w:r>
+        <w:tab/>
+      </w:r>
+      <w:r>
+        <w:tab/>
+      </w:r>
+      <w:r>
+        <w:tab/>
+      </w:r>
+      <w:r>
+        <w:t>{{ PUBLIKATION_GEMEINDE_ENDE }}</w:t>
+      </w:r>
+    </w:p>
+    <w:p>
+      <w:pPr>
+        <w:rPr>
+          <w:rFonts w:eastAsia="Arial" w:cs="Arial"/>
+          <w:szCs w:val="20"/>
+        </w:rPr>
+      </w:pPr>
+      <w:r>
+        <w:rPr>
+          <w:color w:val="000000" w:themeColor="text1"/>
+        </w:rPr>
+        <w:t>Entscheiddokumente</w:t>
+      </w:r>
+      <w:r>
+        <w:tab/>
+      </w:r>
+      <w:r>
+        <w:tab/>
+      </w:r>
+      <w:r>
+        <w:rPr>
+          <w:rFonts w:eastAsia="Arial" w:cs="Arial"/>
+          <w:color w:val="000000" w:themeColor="text1"/>
+          <w:szCs w:val="20"/>
+        </w:rPr>
+        <w:t>{{ ENTSCHEIDDOKUMENTE }}</w:t>
       </w:r>
     </w:p>
     <w:p>
@@ -990,7 +821,6 @@
           <w:color w:val="000000" w:themeColor="text1"/>
           <w:szCs w:val="20"/>
         </w:rPr>
-        <w:lastRenderedPageBreak/>
         <w:t xml:space="preserve">Die Gebühr für die </w:t>
       </w:r>
       <w:r>
@@ -1054,7 +884,7 @@
           </w:tcPr>
           <w:p>
             <w:pPr>
-              <w:pStyle w:val="StandardWeb"/>
+              <w:pStyle w:val="NormalWeb"/>
               <w:spacing w:after="140"/>
               <w:rPr>
                 <w:rFonts w:eastAsia="Arial"/>
@@ -1069,61 +899,7 @@
                 <w:color w:val="000000"/>
                 <w:szCs w:val="20"/>
               </w:rPr>
-              <w:t>{%</w:t>
-            </w:r>
-            <w:proofErr w:type="spellStart"/>
-            <w:r>
-              <w:rPr>
-                <w:rFonts w:eastAsia="Arial"/>
-                <w:color w:val="000000"/>
-                <w:szCs w:val="20"/>
-              </w:rPr>
-              <w:t>tr</w:t>
-            </w:r>
-            <w:proofErr w:type="spellEnd"/>
-            <w:r>
-              <w:rPr>
-                <w:rFonts w:eastAsia="Arial"/>
-                <w:color w:val="000000"/>
-                <w:szCs w:val="20"/>
-              </w:rPr>
-              <w:t xml:space="preserve"> </w:t>
-            </w:r>
-            <w:proofErr w:type="spellStart"/>
-            <w:r>
-              <w:rPr>
-                <w:rFonts w:eastAsia="Arial"/>
-                <w:color w:val="000000"/>
-                <w:szCs w:val="20"/>
-              </w:rPr>
-              <w:t>for</w:t>
-            </w:r>
-            <w:proofErr w:type="spellEnd"/>
-            <w:r>
-              <w:rPr>
-                <w:rFonts w:eastAsia="Arial"/>
-                <w:color w:val="000000"/>
-                <w:szCs w:val="20"/>
-              </w:rPr>
-              <w:t xml:space="preserve"> GEBUEHR in GEBUEHREN </w:t>
-            </w:r>
-            <w:proofErr w:type="spellStart"/>
-            <w:r>
-              <w:rPr>
-                <w:rFonts w:eastAsia="Arial"/>
-                <w:color w:val="000000"/>
-                <w:szCs w:val="20"/>
-              </w:rPr>
-              <w:t>if</w:t>
-            </w:r>
-            <w:proofErr w:type="spellEnd"/>
-            <w:r>
-              <w:rPr>
-                <w:rFonts w:eastAsia="Arial"/>
-                <w:color w:val="000000"/>
-                <w:szCs w:val="20"/>
-              </w:rPr>
-              <w:t xml:space="preserve"> not GEBUEHR.VERRECHNET_AM %}</w:t>
+              <w:t>{%tr for GEBUEHR in GEBUEHREN if not GEBUEHR.VERRECHNET_AM %}</w:t>
             </w:r>
           </w:p>
         </w:tc>
@@ -1141,7 +917,7 @@
           </w:tcPr>
           <w:p>
             <w:pPr>
-              <w:pStyle w:val="StandardWeb"/>
+              <w:pStyle w:val="NormalWeb"/>
               <w:spacing w:after="140"/>
               <w:rPr>
                 <w:rFonts w:eastAsia="Arial"/>
@@ -1165,7 +941,7 @@
           </w:tcPr>
           <w:p>
             <w:pPr>
-              <w:pStyle w:val="StandardWeb"/>
+              <w:pStyle w:val="NormalWeb"/>
               <w:spacing w:after="140"/>
               <w:jc w:val="right"/>
               <w:rPr>
@@ -1195,7 +971,7 @@
           </w:tcPr>
           <w:p>
             <w:pPr>
-              <w:pStyle w:val="StandardWeb"/>
+              <w:pStyle w:val="NormalWeb"/>
               <w:spacing w:after="140"/>
               <w:rPr>
                 <w:rFonts w:eastAsia="Arial"/>
@@ -1203,23 +979,13 @@
                 <w:szCs w:val="20"/>
               </w:rPr>
             </w:pPr>
-            <w:proofErr w:type="gramStart"/>
             <w:r>
               <w:rPr>
                 <w:rFonts w:eastAsia="Arial"/>
                 <w:color w:val="000000"/>
                 <w:szCs w:val="20"/>
               </w:rPr>
-              <w:t>{{ GEBUEHR.POSITION</w:t>
-            </w:r>
-            <w:proofErr w:type="gramEnd"/>
-            <w:r>
-              <w:rPr>
-                <w:rFonts w:eastAsia="Arial"/>
-                <w:color w:val="000000"/>
-                <w:szCs w:val="20"/>
-              </w:rPr>
-              <w:t xml:space="preserve"> }}</w:t>
+              <w:t>{{ GEBUEHR.POSITION }}</w:t>
             </w:r>
             <w:r>
               <w:rPr>
@@ -1229,23 +995,13 @@
               </w:rPr>
               <w:t xml:space="preserve"> </w:t>
             </w:r>
-            <w:proofErr w:type="gramStart"/>
             <w:r>
               <w:rPr>
                 <w:rFonts w:eastAsia="Arial"/>
                 <w:color w:val="000000"/>
                 <w:szCs w:val="20"/>
               </w:rPr>
-              <w:t>{{ GEBUEHR.BEMERKUNG</w:t>
-            </w:r>
-            <w:proofErr w:type="gramEnd"/>
-            <w:r>
-              <w:rPr>
-                <w:rFonts w:eastAsia="Arial"/>
-                <w:color w:val="000000"/>
-                <w:szCs w:val="20"/>
-              </w:rPr>
-              <w:t>}}</w:t>
+              <w:t>{{ GEBUEHR.BEMERKUNG}}</w:t>
             </w:r>
           </w:p>
         </w:tc>
@@ -1263,7 +1019,7 @@
           </w:tcPr>
           <w:p>
             <w:pPr>
-              <w:pStyle w:val="StandardWeb"/>
+              <w:pStyle w:val="NormalWeb"/>
               <w:spacing w:after="140"/>
               <w:rPr>
                 <w:rFonts w:eastAsia="Arial"/>
@@ -1295,7 +1051,7 @@
           </w:tcPr>
           <w:p>
             <w:pPr>
-              <w:pStyle w:val="StandardWeb"/>
+              <w:pStyle w:val="NormalWeb"/>
               <w:spacing w:after="140"/>
               <w:jc w:val="right"/>
               <w:rPr>
@@ -1303,21 +1059,12 @@
                 <w:szCs w:val="20"/>
               </w:rPr>
             </w:pPr>
-            <w:proofErr w:type="gramStart"/>
             <w:r>
               <w:rPr>
                 <w:rFonts w:eastAsia="Arial"/>
                 <w:szCs w:val="20"/>
               </w:rPr>
-              <w:t>{{ GEBUEHR.BETRAG</w:t>
-            </w:r>
-            <w:proofErr w:type="gramEnd"/>
-            <w:r>
-              <w:rPr>
-                <w:rFonts w:eastAsia="Arial"/>
-                <w:szCs w:val="20"/>
-              </w:rPr>
-              <w:t xml:space="preserve"> }}</w:t>
+              <w:t>{{ GEBUEHR.BETRAG }}</w:t>
             </w:r>
           </w:p>
         </w:tc>
@@ -1340,7 +1087,7 @@
           </w:tcPr>
           <w:p>
             <w:pPr>
-              <w:pStyle w:val="StandardWeb"/>
+              <w:pStyle w:val="NormalWeb"/>
               <w:spacing w:after="140"/>
               <w:rPr>
                 <w:rFonts w:eastAsia="Arial"/>
@@ -1354,43 +1101,7 @@
                 <w:color w:val="000000"/>
                 <w:szCs w:val="20"/>
               </w:rPr>
-              <w:t>{%</w:t>
-            </w:r>
-            <w:proofErr w:type="spellStart"/>
-            <w:r>
-              <w:rPr>
-                <w:rFonts w:eastAsia="Arial"/>
-                <w:color w:val="000000"/>
-                <w:szCs w:val="20"/>
-              </w:rPr>
-              <w:t>tr</w:t>
-            </w:r>
-            <w:proofErr w:type="spellEnd"/>
-            <w:r>
-              <w:rPr>
-                <w:rFonts w:eastAsia="Arial"/>
-                <w:color w:val="000000"/>
-                <w:szCs w:val="20"/>
-              </w:rPr>
-              <w:t xml:space="preserve"> </w:t>
-            </w:r>
-            <w:proofErr w:type="spellStart"/>
-            <w:r>
-              <w:rPr>
-                <w:rFonts w:eastAsia="Arial"/>
-                <w:color w:val="000000"/>
-                <w:szCs w:val="20"/>
-              </w:rPr>
-              <w:t>endfor</w:t>
-            </w:r>
-            <w:proofErr w:type="spellEnd"/>
-            <w:r>
-              <w:rPr>
-                <w:rFonts w:eastAsia="Arial"/>
-                <w:color w:val="000000"/>
-                <w:szCs w:val="20"/>
-              </w:rPr>
-              <w:t xml:space="preserve"> %}</w:t>
+              <w:t>{%tr endfor %}</w:t>
             </w:r>
           </w:p>
         </w:tc>
@@ -1408,7 +1119,7 @@
           </w:tcPr>
           <w:p>
             <w:pPr>
-              <w:pStyle w:val="StandardWeb"/>
+              <w:pStyle w:val="NormalWeb"/>
               <w:spacing w:after="140"/>
               <w:rPr>
                 <w:rFonts w:eastAsia="Arial"/>
@@ -1432,7 +1143,7 @@
           </w:tcPr>
           <w:p>
             <w:pPr>
-              <w:pStyle w:val="StandardWeb"/>
+              <w:pStyle w:val="NormalWeb"/>
               <w:spacing w:after="140"/>
               <w:jc w:val="right"/>
               <w:rPr>
@@ -1462,7 +1173,7 @@
           </w:tcPr>
           <w:p>
             <w:pPr>
-              <w:pStyle w:val="StandardWeb"/>
+              <w:pStyle w:val="NormalWeb"/>
               <w:spacing w:after="140"/>
               <w:rPr>
                 <w:rFonts w:eastAsia="Arial"/>
@@ -1498,7 +1209,7 @@
           </w:tcPr>
           <w:p>
             <w:pPr>
-              <w:pStyle w:val="StandardWeb"/>
+              <w:pStyle w:val="NormalWeb"/>
               <w:spacing w:after="140"/>
               <w:rPr>
                 <w:rFonts w:eastAsia="Arial"/>
@@ -1534,7 +1245,7 @@
           </w:tcPr>
           <w:p>
             <w:pPr>
-              <w:pStyle w:val="StandardWeb"/>
+              <w:pStyle w:val="NormalWeb"/>
               <w:spacing w:after="140"/>
               <w:jc w:val="right"/>
               <w:rPr>
@@ -1544,7 +1255,6 @@
                 <w:szCs w:val="20"/>
               </w:rPr>
             </w:pPr>
-            <w:proofErr w:type="gramStart"/>
             <w:r>
               <w:rPr>
                 <w:rFonts w:eastAsia="Arial"/>
@@ -1552,17 +1262,7 @@
                 <w:bCs/>
                 <w:szCs w:val="20"/>
               </w:rPr>
-              <w:t>{{ GEBUEHREN</w:t>
-            </w:r>
-            <w:proofErr w:type="gramEnd"/>
-            <w:r>
-              <w:rPr>
-                <w:rFonts w:eastAsia="Arial"/>
-                <w:b/>
-                <w:bCs/>
-                <w:szCs w:val="20"/>
-              </w:rPr>
-              <w:t>_TOTAL_NICHT_VERRECHNET }}</w:t>
+              <w:t>{{ GEBUEHREN_TOTAL_NICHT_VERRECHNET }}</w:t>
             </w:r>
           </w:p>
         </w:tc>
@@ -1625,15 +1325,7 @@
         <w:t>kann innert einer nicht erstreckbaren Frist von 30 Tagen seit Zustellung</w:t>
       </w:r>
       <w:r>
-        <w:t xml:space="preserve"> schriftlich beim Regierungsrat des Kantons Aargau, Regierungsgebäude, 5001 Aarau, Beschwerde geführt werden. Vor dem Regierungsrat gelten die </w:t>
-      </w:r>
-      <w:proofErr w:type="spellStart"/>
-      <w:r>
-        <w:t>Rechtsstillstandsfristen</w:t>
-      </w:r>
-      <w:proofErr w:type="spellEnd"/>
-      <w:r>
-        <w:t xml:space="preserve"> nicht.</w:t>
+        <w:t xml:space="preserve"> schriftlich beim Regierungsrat des Kantons Aargau, Regierungsgebäude, 5001 Aarau, Beschwerde geführt werden. Vor dem Regierungsrat gelten die Rechtsstillstandsfristen nicht.</w:t>
       </w:r>
     </w:p>
     <w:p>
@@ -2367,7 +2059,7 @@
     <w:lsdException w:name="Unresolved Mention" w:semiHidden="1" w:unhideWhenUsed="1"/>
     <w:lsdException w:name="Smart Link" w:semiHidden="1" w:unhideWhenUsed="1"/>
   </w:latentStyles>
-  <w:style w:type="paragraph" w:default="1" w:styleId="Standard">
+  <w:style w:type="paragraph" w:default="1" w:styleId="Normal">
     <w:name w:val="Normal"/>
     <w:qFormat/>
     <w:rsid w:val="00A367A5"/>
@@ -2379,11 +2071,11 @@
       <w:sz w:val="20"/>
     </w:rPr>
   </w:style>
-  <w:style w:type="paragraph" w:styleId="berschrift1">
+  <w:style w:type="paragraph" w:styleId="Heading1">
     <w:name w:val="heading 1"/>
-    <w:basedOn w:val="Standard"/>
-    <w:next w:val="Standard"/>
-    <w:link w:val="berschrift1Zchn"/>
+    <w:basedOn w:val="Normal"/>
+    <w:next w:val="Normal"/>
+    <w:link w:val="Heading1Char"/>
     <w:uiPriority w:val="9"/>
     <w:qFormat/>
     <w:rsid w:val="006D3C33"/>
@@ -2400,11 +2092,11 @@
       <w:szCs w:val="40"/>
     </w:rPr>
   </w:style>
-  <w:style w:type="paragraph" w:styleId="berschrift2">
+  <w:style w:type="paragraph" w:styleId="Heading2">
     <w:name w:val="heading 2"/>
-    <w:basedOn w:val="Standard"/>
-    <w:next w:val="Standard"/>
-    <w:link w:val="berschrift2Zchn"/>
+    <w:basedOn w:val="Normal"/>
+    <w:next w:val="Normal"/>
+    <w:link w:val="Heading2Char"/>
     <w:uiPriority w:val="9"/>
     <w:semiHidden/>
     <w:unhideWhenUsed/>
@@ -2423,11 +2115,11 @@
       <w:szCs w:val="32"/>
     </w:rPr>
   </w:style>
-  <w:style w:type="paragraph" w:styleId="berschrift3">
+  <w:style w:type="paragraph" w:styleId="Heading3">
     <w:name w:val="heading 3"/>
-    <w:basedOn w:val="Standard"/>
-    <w:next w:val="Standard"/>
-    <w:link w:val="berschrift3Zchn"/>
+    <w:basedOn w:val="Normal"/>
+    <w:next w:val="Normal"/>
+    <w:link w:val="Heading3Char"/>
     <w:uiPriority w:val="9"/>
     <w:semiHidden/>
     <w:unhideWhenUsed/>
@@ -2446,11 +2138,11 @@
       <w:szCs w:val="28"/>
     </w:rPr>
   </w:style>
-  <w:style w:type="paragraph" w:styleId="berschrift4">
+  <w:style w:type="paragraph" w:styleId="Heading4">
     <w:name w:val="heading 4"/>
-    <w:basedOn w:val="Standard"/>
-    <w:next w:val="Standard"/>
-    <w:link w:val="berschrift4Zchn"/>
+    <w:basedOn w:val="Normal"/>
+    <w:next w:val="Normal"/>
+    <w:link w:val="Heading4Char"/>
     <w:uiPriority w:val="9"/>
     <w:semiHidden/>
     <w:unhideWhenUsed/>
@@ -2469,11 +2161,11 @@
       <w:color w:val="0F4761" w:themeColor="accent1" w:themeShade="BF"/>
     </w:rPr>
   </w:style>
-  <w:style w:type="paragraph" w:styleId="berschrift5">
+  <w:style w:type="paragraph" w:styleId="Heading5">
     <w:name w:val="heading 5"/>
-    <w:basedOn w:val="Standard"/>
-    <w:next w:val="Standard"/>
-    <w:link w:val="berschrift5Zchn"/>
+    <w:basedOn w:val="Normal"/>
+    <w:next w:val="Normal"/>
+    <w:link w:val="Heading5Char"/>
     <w:uiPriority w:val="9"/>
     <w:semiHidden/>
     <w:unhideWhenUsed/>
@@ -2490,11 +2182,11 @@
       <w:color w:val="0F4761" w:themeColor="accent1" w:themeShade="BF"/>
     </w:rPr>
   </w:style>
-  <w:style w:type="paragraph" w:styleId="berschrift6">
+  <w:style w:type="paragraph" w:styleId="Heading6">
     <w:name w:val="heading 6"/>
-    <w:basedOn w:val="Standard"/>
-    <w:next w:val="Standard"/>
-    <w:link w:val="berschrift6Zchn"/>
+    <w:basedOn w:val="Normal"/>
+    <w:next w:val="Normal"/>
+    <w:link w:val="Heading6Char"/>
     <w:uiPriority w:val="9"/>
     <w:semiHidden/>
     <w:unhideWhenUsed/>
@@ -2513,11 +2205,11 @@
       <w:color w:val="595959" w:themeColor="text1" w:themeTint="A6"/>
     </w:rPr>
   </w:style>
-  <w:style w:type="paragraph" w:styleId="berschrift7">
+  <w:style w:type="paragraph" w:styleId="Heading7">
     <w:name w:val="heading 7"/>
-    <w:basedOn w:val="Standard"/>
-    <w:next w:val="Standard"/>
-    <w:link w:val="berschrift7Zchn"/>
+    <w:basedOn w:val="Normal"/>
+    <w:next w:val="Normal"/>
+    <w:link w:val="Heading7Char"/>
     <w:uiPriority w:val="9"/>
     <w:semiHidden/>
     <w:unhideWhenUsed/>
@@ -2534,11 +2226,11 @@
       <w:color w:val="595959" w:themeColor="text1" w:themeTint="A6"/>
     </w:rPr>
   </w:style>
-  <w:style w:type="paragraph" w:styleId="berschrift8">
+  <w:style w:type="paragraph" w:styleId="Heading8">
     <w:name w:val="heading 8"/>
-    <w:basedOn w:val="Standard"/>
-    <w:next w:val="Standard"/>
-    <w:link w:val="berschrift8Zchn"/>
+    <w:basedOn w:val="Normal"/>
+    <w:next w:val="Normal"/>
+    <w:link w:val="Heading8Char"/>
     <w:uiPriority w:val="9"/>
     <w:semiHidden/>
     <w:unhideWhenUsed/>
@@ -2557,11 +2249,11 @@
       <w:color w:val="272727" w:themeColor="text1" w:themeTint="D8"/>
     </w:rPr>
   </w:style>
-  <w:style w:type="paragraph" w:styleId="berschrift9">
+  <w:style w:type="paragraph" w:styleId="Heading9">
     <w:name w:val="heading 9"/>
-    <w:basedOn w:val="Standard"/>
-    <w:next w:val="Standard"/>
-    <w:link w:val="berschrift9Zchn"/>
+    <w:basedOn w:val="Normal"/>
+    <w:next w:val="Normal"/>
+    <w:link w:val="Heading9Char"/>
     <w:uiPriority w:val="9"/>
     <w:semiHidden/>
     <w:unhideWhenUsed/>
@@ -2578,13 +2270,13 @@
       <w:color w:val="272727" w:themeColor="text1" w:themeTint="D8"/>
     </w:rPr>
   </w:style>
-  <w:style w:type="character" w:default="1" w:styleId="Absatz-Standardschriftart">
+  <w:style w:type="character" w:default="1" w:styleId="DefaultParagraphFont">
     <w:name w:val="Default Paragraph Font"/>
     <w:uiPriority w:val="1"/>
     <w:semiHidden/>
     <w:unhideWhenUsed/>
   </w:style>
-  <w:style w:type="table" w:default="1" w:styleId="NormaleTabelle">
+  <w:style w:type="table" w:default="1" w:styleId="TableNormal">
     <w:name w:val="Normal Table"/>
     <w:uiPriority w:val="99"/>
     <w:semiHidden/>
@@ -2599,16 +2291,16 @@
       </w:tblCellMar>
     </w:tblPr>
   </w:style>
-  <w:style w:type="numbering" w:default="1" w:styleId="KeineListe">
+  <w:style w:type="numbering" w:default="1" w:styleId="NoList">
     <w:name w:val="No List"/>
     <w:uiPriority w:val="99"/>
     <w:semiHidden/>
     <w:unhideWhenUsed/>
   </w:style>
-  <w:style w:type="character" w:customStyle="1" w:styleId="berschrift1Zchn">
-    <w:name w:val="Überschrift 1 Zchn"/>
-    <w:basedOn w:val="Absatz-Standardschriftart"/>
-    <w:link w:val="berschrift1"/>
+  <w:style w:type="character" w:customStyle="1" w:styleId="Heading1Char">
+    <w:name w:val="Heading 1 Char"/>
+    <w:basedOn w:val="DefaultParagraphFont"/>
+    <w:link w:val="Heading1"/>
     <w:uiPriority w:val="9"/>
     <w:rsid w:val="006D3C33"/>
     <w:rPr>
@@ -2618,10 +2310,10 @@
       <w:szCs w:val="40"/>
     </w:rPr>
   </w:style>
-  <w:style w:type="character" w:customStyle="1" w:styleId="berschrift2Zchn">
-    <w:name w:val="Überschrift 2 Zchn"/>
-    <w:basedOn w:val="Absatz-Standardschriftart"/>
-    <w:link w:val="berschrift2"/>
+  <w:style w:type="character" w:customStyle="1" w:styleId="Heading2Char">
+    <w:name w:val="Heading 2 Char"/>
+    <w:basedOn w:val="DefaultParagraphFont"/>
+    <w:link w:val="Heading2"/>
     <w:uiPriority w:val="9"/>
     <w:semiHidden/>
     <w:rsid w:val="006D3C33"/>
@@ -2632,10 +2324,10 @@
       <w:szCs w:val="32"/>
     </w:rPr>
   </w:style>
-  <w:style w:type="character" w:customStyle="1" w:styleId="berschrift3Zchn">
-    <w:name w:val="Überschrift 3 Zchn"/>
-    <w:basedOn w:val="Absatz-Standardschriftart"/>
-    <w:link w:val="berschrift3"/>
+  <w:style w:type="character" w:customStyle="1" w:styleId="Heading3Char">
+    <w:name w:val="Heading 3 Char"/>
+    <w:basedOn w:val="DefaultParagraphFont"/>
+    <w:link w:val="Heading3"/>
     <w:uiPriority w:val="9"/>
     <w:semiHidden/>
     <w:rsid w:val="006D3C33"/>
@@ -2646,10 +2338,10 @@
       <w:szCs w:val="28"/>
     </w:rPr>
   </w:style>
-  <w:style w:type="character" w:customStyle="1" w:styleId="berschrift4Zchn">
-    <w:name w:val="Überschrift 4 Zchn"/>
-    <w:basedOn w:val="Absatz-Standardschriftart"/>
-    <w:link w:val="berschrift4"/>
+  <w:style w:type="character" w:customStyle="1" w:styleId="Heading4Char">
+    <w:name w:val="Heading 4 Char"/>
+    <w:basedOn w:val="DefaultParagraphFont"/>
+    <w:link w:val="Heading4"/>
     <w:uiPriority w:val="9"/>
     <w:semiHidden/>
     <w:rsid w:val="006D3C33"/>
@@ -2661,10 +2353,10 @@
       <w:sz w:val="20"/>
     </w:rPr>
   </w:style>
-  <w:style w:type="character" w:customStyle="1" w:styleId="berschrift5Zchn">
-    <w:name w:val="Überschrift 5 Zchn"/>
-    <w:basedOn w:val="Absatz-Standardschriftart"/>
-    <w:link w:val="berschrift5"/>
+  <w:style w:type="character" w:customStyle="1" w:styleId="Heading5Char">
+    <w:name w:val="Heading 5 Char"/>
+    <w:basedOn w:val="DefaultParagraphFont"/>
+    <w:link w:val="Heading5"/>
     <w:uiPriority w:val="9"/>
     <w:semiHidden/>
     <w:rsid w:val="006D3C33"/>
@@ -2674,10 +2366,10 @@
       <w:sz w:val="20"/>
     </w:rPr>
   </w:style>
-  <w:style w:type="character" w:customStyle="1" w:styleId="berschrift6Zchn">
-    <w:name w:val="Überschrift 6 Zchn"/>
-    <w:basedOn w:val="Absatz-Standardschriftart"/>
-    <w:link w:val="berschrift6"/>
+  <w:style w:type="character" w:customStyle="1" w:styleId="Heading6Char">
+    <w:name w:val="Heading 6 Char"/>
+    <w:basedOn w:val="DefaultParagraphFont"/>
+    <w:link w:val="Heading6"/>
     <w:uiPriority w:val="9"/>
     <w:semiHidden/>
     <w:rsid w:val="006D3C33"/>
@@ -2689,10 +2381,10 @@
       <w:sz w:val="20"/>
     </w:rPr>
   </w:style>
-  <w:style w:type="character" w:customStyle="1" w:styleId="berschrift7Zchn">
-    <w:name w:val="Überschrift 7 Zchn"/>
-    <w:basedOn w:val="Absatz-Standardschriftart"/>
-    <w:link w:val="berschrift7"/>
+  <w:style w:type="character" w:customStyle="1" w:styleId="Heading7Char">
+    <w:name w:val="Heading 7 Char"/>
+    <w:basedOn w:val="DefaultParagraphFont"/>
+    <w:link w:val="Heading7"/>
     <w:uiPriority w:val="9"/>
     <w:semiHidden/>
     <w:rsid w:val="006D3C33"/>
@@ -2702,10 +2394,10 @@
       <w:sz w:val="20"/>
     </w:rPr>
   </w:style>
-  <w:style w:type="character" w:customStyle="1" w:styleId="berschrift8Zchn">
-    <w:name w:val="Überschrift 8 Zchn"/>
-    <w:basedOn w:val="Absatz-Standardschriftart"/>
-    <w:link w:val="berschrift8"/>
+  <w:style w:type="character" w:customStyle="1" w:styleId="Heading8Char">
+    <w:name w:val="Heading 8 Char"/>
+    <w:basedOn w:val="DefaultParagraphFont"/>
+    <w:link w:val="Heading8"/>
     <w:uiPriority w:val="9"/>
     <w:semiHidden/>
     <w:rsid w:val="006D3C33"/>
@@ -2717,10 +2409,10 @@
       <w:sz w:val="20"/>
     </w:rPr>
   </w:style>
-  <w:style w:type="character" w:customStyle="1" w:styleId="berschrift9Zchn">
-    <w:name w:val="Überschrift 9 Zchn"/>
-    <w:basedOn w:val="Absatz-Standardschriftart"/>
-    <w:link w:val="berschrift9"/>
+  <w:style w:type="character" w:customStyle="1" w:styleId="Heading9Char">
+    <w:name w:val="Heading 9 Char"/>
+    <w:basedOn w:val="DefaultParagraphFont"/>
+    <w:link w:val="Heading9"/>
     <w:uiPriority w:val="9"/>
     <w:semiHidden/>
     <w:rsid w:val="006D3C33"/>
@@ -2730,11 +2422,11 @@
       <w:sz w:val="20"/>
     </w:rPr>
   </w:style>
-  <w:style w:type="paragraph" w:styleId="Titel">
+  <w:style w:type="paragraph" w:styleId="Title">
     <w:name w:val="Title"/>
-    <w:basedOn w:val="Standard"/>
-    <w:next w:val="Standard"/>
-    <w:link w:val="TitelZchn"/>
+    <w:basedOn w:val="Normal"/>
+    <w:next w:val="Normal"/>
+    <w:link w:val="TitleChar"/>
     <w:uiPriority w:val="10"/>
     <w:qFormat/>
     <w:rsid w:val="006D3C33"/>
@@ -2750,10 +2442,10 @@
       <w:szCs w:val="56"/>
     </w:rPr>
   </w:style>
-  <w:style w:type="character" w:customStyle="1" w:styleId="TitelZchn">
-    <w:name w:val="Titel Zchn"/>
-    <w:basedOn w:val="Absatz-Standardschriftart"/>
-    <w:link w:val="Titel"/>
+  <w:style w:type="character" w:customStyle="1" w:styleId="TitleChar">
+    <w:name w:val="Title Char"/>
+    <w:basedOn w:val="DefaultParagraphFont"/>
+    <w:link w:val="Title"/>
     <w:uiPriority w:val="10"/>
     <w:rsid w:val="006D3C33"/>
     <w:rPr>
@@ -2764,11 +2456,11 @@
       <w:szCs w:val="56"/>
     </w:rPr>
   </w:style>
-  <w:style w:type="paragraph" w:styleId="Untertitel">
+  <w:style w:type="paragraph" w:styleId="Subtitle">
     <w:name w:val="Subtitle"/>
-    <w:basedOn w:val="Standard"/>
-    <w:next w:val="Standard"/>
-    <w:link w:val="UntertitelZchn"/>
+    <w:basedOn w:val="Normal"/>
+    <w:next w:val="Normal"/>
+    <w:link w:val="SubtitleChar"/>
     <w:uiPriority w:val="11"/>
     <w:qFormat/>
     <w:rsid w:val="006D3C33"/>
@@ -2786,10 +2478,10 @@
       <w:szCs w:val="28"/>
     </w:rPr>
   </w:style>
-  <w:style w:type="character" w:customStyle="1" w:styleId="UntertitelZchn">
-    <w:name w:val="Untertitel Zchn"/>
-    <w:basedOn w:val="Absatz-Standardschriftart"/>
-    <w:link w:val="Untertitel"/>
+  <w:style w:type="character" w:customStyle="1" w:styleId="SubtitleChar">
+    <w:name w:val="Subtitle Char"/>
+    <w:basedOn w:val="DefaultParagraphFont"/>
+    <w:link w:val="Subtitle"/>
     <w:uiPriority w:val="11"/>
     <w:rsid w:val="006D3C33"/>
     <w:rPr>
@@ -2800,11 +2492,11 @@
       <w:szCs w:val="28"/>
     </w:rPr>
   </w:style>
-  <w:style w:type="paragraph" w:styleId="Zitat">
+  <w:style w:type="paragraph" w:styleId="Quote">
     <w:name w:val="Quote"/>
-    <w:basedOn w:val="Standard"/>
-    <w:next w:val="Standard"/>
-    <w:link w:val="ZitatZchn"/>
+    <w:basedOn w:val="Normal"/>
+    <w:next w:val="Normal"/>
+    <w:link w:val="QuoteChar"/>
     <w:uiPriority w:val="29"/>
     <w:qFormat/>
     <w:rsid w:val="006D3C33"/>
@@ -2818,10 +2510,10 @@
       <w:color w:val="404040" w:themeColor="text1" w:themeTint="BF"/>
     </w:rPr>
   </w:style>
-  <w:style w:type="character" w:customStyle="1" w:styleId="ZitatZchn">
-    <w:name w:val="Zitat Zchn"/>
-    <w:basedOn w:val="Absatz-Standardschriftart"/>
-    <w:link w:val="Zitat"/>
+  <w:style w:type="character" w:customStyle="1" w:styleId="QuoteChar">
+    <w:name w:val="Quote Char"/>
+    <w:basedOn w:val="DefaultParagraphFont"/>
+    <w:link w:val="Quote"/>
     <w:uiPriority w:val="29"/>
     <w:rsid w:val="006D3C33"/>
     <w:rPr>
@@ -2832,9 +2524,9 @@
       <w:sz w:val="20"/>
     </w:rPr>
   </w:style>
-  <w:style w:type="paragraph" w:styleId="Listenabsatz">
+  <w:style w:type="paragraph" w:styleId="ListParagraph">
     <w:name w:val="List Paragraph"/>
-    <w:basedOn w:val="Standard"/>
+    <w:basedOn w:val="Normal"/>
     <w:uiPriority w:val="34"/>
     <w:qFormat/>
     <w:rsid w:val="006D3C33"/>
@@ -2843,9 +2535,9 @@
       <w:contextualSpacing/>
     </w:pPr>
   </w:style>
-  <w:style w:type="character" w:styleId="IntensiveHervorhebung">
+  <w:style w:type="character" w:styleId="IntenseEmphasis">
     <w:name w:val="Intense Emphasis"/>
-    <w:basedOn w:val="Absatz-Standardschriftart"/>
+    <w:basedOn w:val="DefaultParagraphFont"/>
     <w:uiPriority w:val="21"/>
     <w:qFormat/>
     <w:rsid w:val="006D3C33"/>
@@ -2855,11 +2547,11 @@
       <w:color w:val="0F4761" w:themeColor="accent1" w:themeShade="BF"/>
     </w:rPr>
   </w:style>
-  <w:style w:type="paragraph" w:styleId="IntensivesZitat">
+  <w:style w:type="paragraph" w:styleId="IntenseQuote">
     <w:name w:val="Intense Quote"/>
-    <w:basedOn w:val="Standard"/>
-    <w:next w:val="Standard"/>
-    <w:link w:val="IntensivesZitatZchn"/>
+    <w:basedOn w:val="Normal"/>
+    <w:next w:val="Normal"/>
+    <w:link w:val="IntenseQuoteChar"/>
     <w:uiPriority w:val="30"/>
     <w:qFormat/>
     <w:rsid w:val="006D3C33"/>
@@ -2878,10 +2570,10 @@
       <w:color w:val="0F4761" w:themeColor="accent1" w:themeShade="BF"/>
     </w:rPr>
   </w:style>
-  <w:style w:type="character" w:customStyle="1" w:styleId="IntensivesZitatZchn">
-    <w:name w:val="Intensives Zitat Zchn"/>
-    <w:basedOn w:val="Absatz-Standardschriftart"/>
-    <w:link w:val="IntensivesZitat"/>
+  <w:style w:type="character" w:customStyle="1" w:styleId="IntenseQuoteChar">
+    <w:name w:val="Intense Quote Char"/>
+    <w:basedOn w:val="DefaultParagraphFont"/>
+    <w:link w:val="IntenseQuote"/>
     <w:uiPriority w:val="30"/>
     <w:rsid w:val="006D3C33"/>
     <w:rPr>
@@ -2892,9 +2584,9 @@
       <w:sz w:val="20"/>
     </w:rPr>
   </w:style>
-  <w:style w:type="character" w:styleId="IntensiverVerweis">
+  <w:style w:type="character" w:styleId="IntenseReference">
     <w:name w:val="Intense Reference"/>
-    <w:basedOn w:val="Absatz-Standardschriftart"/>
+    <w:basedOn w:val="DefaultParagraphFont"/>
     <w:uiPriority w:val="32"/>
     <w:qFormat/>
     <w:rsid w:val="006D3C33"/>
@@ -2908,7 +2600,7 @@
   </w:style>
   <w:style w:type="paragraph" w:customStyle="1" w:styleId="Nummerierung9">
     <w:name w:val="Nummerierung_9"/>
-    <w:basedOn w:val="Standard"/>
+    <w:basedOn w:val="Normal"/>
     <w:rsid w:val="00F704B1"/>
     <w:pPr>
       <w:tabs>
@@ -2927,9 +2619,9 @@
       <w14:ligatures w14:val="none"/>
     </w:rPr>
   </w:style>
-  <w:style w:type="paragraph" w:styleId="StandardWeb">
+  <w:style w:type="paragraph" w:styleId="NormalWeb">
     <w:name w:val="Normal (Web)"/>
-    <w:basedOn w:val="Standard"/>
+    <w:basedOn w:val="Normal"/>
     <w:rsid w:val="00D30809"/>
     <w:pPr>
       <w:adjustRightInd w:val="0"/>
@@ -3254,6 +2946,15 @@
 </file>
 
 <file path=customXml/item2.xml><?xml version="1.0" encoding="utf-8"?>
+<?mso-contentType ?>
+<FormTemplates xmlns="http://schemas.microsoft.com/sharepoint/v3/contenttype/forms">
+  <Display>DocumentLibraryForm</Display>
+  <Edit>DocumentLibraryForm</Edit>
+  <New>DocumentLibraryForm</New>
+</FormTemplates>
+</file>
+
+<file path=customXml/item3.xml><?xml version="1.0" encoding="utf-8"?>
 <ct:contentTypeSchema xmlns:ct="http://schemas.microsoft.com/office/2006/metadata/contentType" xmlns:ma="http://schemas.microsoft.com/office/2006/metadata/properties/metaAttributes" ct:_="" ma:_="" ma:contentTypeName="Dokument" ma:contentTypeID="0x010100D7FFFCF5F95BC94D9B7DF34B9D0CF76C" ma:contentTypeVersion="14" ma:contentTypeDescription="Ein neues Dokument erstellen." ma:contentTypeScope="" ma:versionID="d5365c3f292752060d21556f4c3719e0">
   <xsd:schema xmlns:xsd="http://www.w3.org/2001/XMLSchema" xmlns:xs="http://www.w3.org/2001/XMLSchema" xmlns:p="http://schemas.microsoft.com/office/2006/metadata/properties" xmlns:ns2="5e238f3b-cf1c-4dc8-b1c3-14677632393c" xmlns:ns3="a7360a35-2516-4210-888a-7cc8dd0a384d" xmlns:ns4="fb274a4b-4ecf-4ae2-a446-66548455045d" targetNamespace="http://schemas.microsoft.com/office/2006/metadata/properties" ma:root="true" ma:fieldsID="4c397c0aac1409cd54cc6313488923be" ns2:_="" ns3:_="" ns4:_="">
     <xsd:import namespace="5e238f3b-cf1c-4dc8-b1c3-14677632393c"/>
@@ -3487,15 +3188,6 @@
 </ct:contentTypeSchema>
 </file>
 
-<file path=customXml/item3.xml><?xml version="1.0" encoding="utf-8"?>
-<?mso-contentType ?>
-<FormTemplates xmlns="http://schemas.microsoft.com/sharepoint/v3/contenttype/forms">
-  <Display>DocumentLibraryForm</Display>
-  <Edit>DocumentLibraryForm</Edit>
-  <New>DocumentLibraryForm</New>
-</FormTemplates>
-</file>
-
 <file path=customXml/itemProps1.xml><?xml version="1.0" encoding="utf-8"?>
 <ds:datastoreItem xmlns:ds="http://schemas.openxmlformats.org/officeDocument/2006/customXml" ds:itemID="{C976AC22-6A54-4061-AC2E-7766E4F8B582}">
   <ds:schemaRefs>
@@ -3508,6 +3200,14 @@
 </file>
 
 <file path=customXml/itemProps2.xml><?xml version="1.0" encoding="utf-8"?>
+<ds:datastoreItem xmlns:ds="http://schemas.openxmlformats.org/officeDocument/2006/customXml" ds:itemID="{D003E5D4-A01B-4742-8C01-12E6BFEF56D6}">
+  <ds:schemaRefs>
+    <ds:schemaRef ds:uri="http://schemas.microsoft.com/sharepoint/v3/contenttype/forms"/>
+  </ds:schemaRefs>
+</ds:datastoreItem>
+</file>
+
+<file path=customXml/itemProps3.xml><?xml version="1.0" encoding="utf-8"?>
 <ds:datastoreItem xmlns:ds="http://schemas.openxmlformats.org/officeDocument/2006/customXml" ds:itemID="{5AC8AF81-2222-49C9-942D-9B5B940CE04C}">
   <ds:schemaRefs>
     <ds:schemaRef ds:uri="http://schemas.microsoft.com/office/2006/metadata/contentType"/>
@@ -3525,12 +3225,4 @@
     <ds:schemaRef ds:uri="http://schemas.microsoft.com/internal/obd"/>
   </ds:schemaRefs>
 </ds:datastoreItem>
-</file>
-
-<file path=customXml/itemProps3.xml><?xml version="1.0" encoding="utf-8"?>
-<ds:datastoreItem xmlns:ds="http://schemas.openxmlformats.org/officeDocument/2006/customXml" ds:itemID="{D003E5D4-A01B-4742-8C01-12E6BFEF56D6}">
-  <ds:schemaRefs>
-    <ds:schemaRef ds:uri="http://schemas.microsoft.com/sharepoint/v3/contenttype/forms"/>
-  </ds:schemaRefs>
-</ds:datastoreItem>
 </file>
</xml_diff>